<commit_message>
gitAuto manual push @ 2026-03-21 06:38:35
</commit_message>
<xml_diff>
--- a/docs/Report/网络管理与运维实践2 雷若奇-网工2301-23053020134.docx
+++ b/docs/Report/网络管理与运维实践2 雷若奇-网工2301-23053020134.docx
@@ -70,12 +70,6 @@
             <w:insideH w:val="single" w:color="auto" w:sz="4" w:space="0"/>
             <w:insideV w:val="single" w:color="auto" w:sz="4" w:space="0"/>
           </w:tblBorders>
-          <w:tblCellMar>
-            <w:top w:w="0" w:type="dxa"/>
-            <w:left w:w="108" w:type="dxa"/>
-            <w:bottom w:w="0" w:type="dxa"/>
-            <w:right w:w="108" w:type="dxa"/>
-          </w:tblCellMar>
         </w:tblPrEx>
         <w:tc>
           <w:tcPr>
@@ -187,6 +181,15 @@
                 <w:szCs w:val="24"/>
               </w:rPr>
             </w:pPr>
+            <w:r>
+              <w:rPr>
+                <w:rFonts w:hint="eastAsia"/>
+                <w:sz w:val="24"/>
+                <w:szCs w:val="24"/>
+                <w:lang w:eastAsia="zh-CN"/>
+              </w:rPr>
+              <w:t>网络工程2301班</w:t>
+            </w:r>
           </w:p>
         </w:tc>
       </w:tr>
@@ -246,6 +249,15 @@
                 <w:szCs w:val="24"/>
               </w:rPr>
             </w:pPr>
+            <w:r>
+              <w:rPr>
+                <w:rFonts w:hint="eastAsia"/>
+                <w:sz w:val="24"/>
+                <w:szCs w:val="24"/>
+                <w:lang w:eastAsia="zh-CN"/>
+              </w:rPr>
+              <w:t>雷若奇</w:t>
+            </w:r>
           </w:p>
         </w:tc>
       </w:tr>
@@ -281,141 +293,953 @@
           <w:szCs w:val="24"/>
           <w:lang w:val="en-US" w:eastAsia="zh-CN"/>
         </w:rPr>
-        <w:t>截图需要包含姓名、</w:t>
+        <w:t>截图需要包含姓名、学号水印</w:t>
+      </w:r>
+      <w:r>
+        <w:rPr>
+          <w:rFonts w:hint="eastAsia"/>
+          <w:sz w:val="24"/>
+          <w:szCs w:val="24"/>
+          <w:lang w:eastAsia="zh-CN"/>
+        </w:rPr>
+        <w:t>）</w:t>
+      </w:r>
+      <w:r>
+        <w:rPr>
+          <w:sz w:val="24"/>
+          <w:szCs w:val="24"/>
+        </w:rPr>
+        <w:t>：</w:t>
+      </w:r>
+    </w:p>
+    <w:p>
+      <w:pPr>
+        <w:widowControl w:val="0"/>
+        <w:numPr>
+          <w:ilvl w:val="0"/>
+          <w:numId w:val="1"/>
+        </w:numPr>
+        <w:jc w:val="both"/>
+        <w:rPr>
+          <w:rFonts w:hint="default" w:eastAsiaTheme="minorEastAsia"/>
+          <w:sz w:val="24"/>
+          <w:szCs w:val="24"/>
+          <w:lang w:val="en-US" w:eastAsia="zh-CN"/>
+        </w:rPr>
+      </w:pPr>
+      <w:r>
+        <w:rPr>
+          <w:rFonts w:hint="eastAsia"/>
+          <w:sz w:val="24"/>
+          <w:szCs w:val="24"/>
+          <w:lang w:val="en-US" w:eastAsia="zh-CN"/>
+        </w:rPr>
+        <w:t>配置cloud</w:t>
+      </w:r>
+    </w:p>
+    <w:p>
+      <w:pPr>
+        <w:widowControl w:val="0"/>
+        <w:numPr>
+          <w:numId w:val="0"/>
+        </w:numPr>
+        <w:jc w:val="both"/>
+        <w:rPr>
+          <w:sz w:val="24"/>
+          <w:szCs w:val="24"/>
+        </w:rPr>
+      </w:pPr>
+      <w:r>
+        <w:drawing>
+          <wp:inline distT="0" distB="0" distL="114300" distR="114300">
+            <wp:extent cx="5273675" cy="3599180"/>
+            <wp:effectExtent l="0" t="0" r="3175" b="1270"/>
+            <wp:docPr id="1" name="图片 1"/>
+            <wp:cNvGraphicFramePr>
+              <a:graphicFrameLocks xmlns:a="http://schemas.openxmlformats.org/drawingml/2006/main" noChangeAspect="1"/>
+            </wp:cNvGraphicFramePr>
+            <a:graphic xmlns:a="http://schemas.openxmlformats.org/drawingml/2006/main">
+              <a:graphicData uri="http://schemas.openxmlformats.org/drawingml/2006/picture">
+                <pic:pic xmlns:pic="http://schemas.openxmlformats.org/drawingml/2006/picture">
+                  <pic:nvPicPr>
+                    <pic:cNvPr id="1" name="图片 1"/>
+                    <pic:cNvPicPr>
+                      <a:picLocks noChangeAspect="1"/>
+                    </pic:cNvPicPr>
+                  </pic:nvPicPr>
+                  <pic:blipFill>
+                    <a:blip r:embed="rId4"/>
+                    <a:stretch>
+                      <a:fillRect/>
+                    </a:stretch>
+                  </pic:blipFill>
+                  <pic:spPr>
+                    <a:xfrm>
+                      <a:off x="0" y="0"/>
+                      <a:ext cx="5273675" cy="3599180"/>
+                    </a:xfrm>
+                    <a:prstGeom prst="rect">
+                      <a:avLst/>
+                    </a:prstGeom>
+                    <a:noFill/>
+                    <a:ln>
+                      <a:noFill/>
+                    </a:ln>
+                  </pic:spPr>
+                </pic:pic>
+              </a:graphicData>
+            </a:graphic>
+          </wp:inline>
+        </w:drawing>
+      </w:r>
+    </w:p>
+    <w:p>
+      <w:pPr>
+        <w:numPr>
+          <w:ilvl w:val="0"/>
+          <w:numId w:val="1"/>
+        </w:numPr>
+        <w:ind w:left="0" w:leftChars="0" w:firstLine="0" w:firstLineChars="0"/>
+        <w:rPr>
+          <w:rFonts w:hint="eastAsia" w:eastAsiaTheme="minorEastAsia"/>
+          <w:sz w:val="24"/>
+          <w:szCs w:val="24"/>
+          <w:lang w:val="en-US" w:eastAsia="zh-CN"/>
+        </w:rPr>
+      </w:pPr>
+      <w:r>
+        <w:rPr>
+          <w:rFonts w:hint="eastAsia"/>
+          <w:sz w:val="24"/>
+          <w:szCs w:val="24"/>
+          <w:lang w:val="en-US" w:eastAsia="zh-CN"/>
+        </w:rPr>
+        <w:t>将G0/0/7设置进vlan3</w:t>
+      </w:r>
+    </w:p>
+    <w:p>
+      <w:pPr>
+        <w:numPr>
+          <w:numId w:val="0"/>
+        </w:numPr>
+        <w:ind w:leftChars="0"/>
+        <w:rPr>
+          <w:sz w:val="24"/>
+          <w:szCs w:val="24"/>
+        </w:rPr>
+      </w:pPr>
+      <w:r>
+        <w:drawing>
+          <wp:inline distT="0" distB="0" distL="114300" distR="114300">
+            <wp:extent cx="3152140" cy="2131060"/>
+            <wp:effectExtent l="0" t="0" r="10160" b="2540"/>
+            <wp:docPr id="2" name="图片 2"/>
+            <wp:cNvGraphicFramePr>
+              <a:graphicFrameLocks xmlns:a="http://schemas.openxmlformats.org/drawingml/2006/main" noChangeAspect="1"/>
+            </wp:cNvGraphicFramePr>
+            <a:graphic xmlns:a="http://schemas.openxmlformats.org/drawingml/2006/main">
+              <a:graphicData uri="http://schemas.openxmlformats.org/drawingml/2006/picture">
+                <pic:pic xmlns:pic="http://schemas.openxmlformats.org/drawingml/2006/picture">
+                  <pic:nvPicPr>
+                    <pic:cNvPr id="2" name="图片 2"/>
+                    <pic:cNvPicPr>
+                      <a:picLocks noChangeAspect="1"/>
+                    </pic:cNvPicPr>
+                  </pic:nvPicPr>
+                  <pic:blipFill>
+                    <a:blip r:embed="rId5"/>
+                    <a:stretch>
+                      <a:fillRect/>
+                    </a:stretch>
+                  </pic:blipFill>
+                  <pic:spPr>
+                    <a:xfrm>
+                      <a:off x="0" y="0"/>
+                      <a:ext cx="3152140" cy="2131060"/>
+                    </a:xfrm>
+                    <a:prstGeom prst="rect">
+                      <a:avLst/>
+                    </a:prstGeom>
+                    <a:noFill/>
+                    <a:ln>
+                      <a:noFill/>
+                    </a:ln>
+                  </pic:spPr>
+                </pic:pic>
+              </a:graphicData>
+            </a:graphic>
+          </wp:inline>
+        </w:drawing>
+      </w:r>
+    </w:p>
+    <w:p>
+      <w:pPr>
+        <w:numPr>
+          <w:ilvl w:val="0"/>
+          <w:numId w:val="1"/>
+        </w:numPr>
+        <w:ind w:left="0" w:leftChars="0" w:firstLine="0" w:firstLineChars="0"/>
+        <w:rPr>
+          <w:rFonts w:hint="eastAsia" w:eastAsiaTheme="minorEastAsia"/>
+          <w:sz w:val="24"/>
+          <w:szCs w:val="24"/>
+          <w:lang w:val="en-US" w:eastAsia="zh-CN"/>
+        </w:rPr>
+      </w:pPr>
+      <w:r>
+        <w:rPr>
+          <w:rFonts w:hint="eastAsia"/>
+          <w:sz w:val="24"/>
+          <w:szCs w:val="24"/>
+          <w:lang w:val="en-US" w:eastAsia="zh-CN"/>
+        </w:rPr>
+        <w:t>配置SZ1,2和S1,2,4的telnet（操作重复，所以仅展示一次）</w:t>
+      </w:r>
+      <w:r>
+        <w:rPr>
+          <w:rFonts w:hint="eastAsia"/>
+          <w:sz w:val="24"/>
+          <w:szCs w:val="24"/>
+          <w:lang w:val="en-US" w:eastAsia="zh-CN"/>
+        </w:rPr>
+        <w:br w:type="textWrapping"/>
+      </w:r>
+      <w:r>
+        <w:drawing>
+          <wp:inline distT="0" distB="0" distL="114300" distR="114300">
+            <wp:extent cx="5269865" cy="3587115"/>
+            <wp:effectExtent l="0" t="0" r="6985" b="13335"/>
+            <wp:docPr id="3" name="图片 3"/>
+            <wp:cNvGraphicFramePr>
+              <a:graphicFrameLocks xmlns:a="http://schemas.openxmlformats.org/drawingml/2006/main" noChangeAspect="1"/>
+            </wp:cNvGraphicFramePr>
+            <a:graphic xmlns:a="http://schemas.openxmlformats.org/drawingml/2006/main">
+              <a:graphicData uri="http://schemas.openxmlformats.org/drawingml/2006/picture">
+                <pic:pic xmlns:pic="http://schemas.openxmlformats.org/drawingml/2006/picture">
+                  <pic:nvPicPr>
+                    <pic:cNvPr id="3" name="图片 3"/>
+                    <pic:cNvPicPr>
+                      <a:picLocks noChangeAspect="1"/>
+                    </pic:cNvPicPr>
+                  </pic:nvPicPr>
+                  <pic:blipFill>
+                    <a:blip r:embed="rId6"/>
+                    <a:stretch>
+                      <a:fillRect/>
+                    </a:stretch>
+                  </pic:blipFill>
+                  <pic:spPr>
+                    <a:xfrm>
+                      <a:off x="0" y="0"/>
+                      <a:ext cx="5269865" cy="3587115"/>
+                    </a:xfrm>
+                    <a:prstGeom prst="rect">
+                      <a:avLst/>
+                    </a:prstGeom>
+                    <a:noFill/>
+                    <a:ln>
+                      <a:noFill/>
+                    </a:ln>
+                  </pic:spPr>
+                </pic:pic>
+              </a:graphicData>
+            </a:graphic>
+          </wp:inline>
+        </w:drawing>
+      </w:r>
+      <w:r>
+        <w:br w:type="textWrapping"/>
+      </w:r>
+    </w:p>
+    <w:p>
+      <w:pPr>
+        <w:numPr>
+          <w:ilvl w:val="0"/>
+          <w:numId w:val="1"/>
+        </w:numPr>
+        <w:ind w:left="0" w:leftChars="0" w:firstLine="0" w:firstLineChars="0"/>
+        <w:rPr>
+          <w:rFonts w:hint="eastAsia" w:eastAsiaTheme="minorEastAsia"/>
+          <w:sz w:val="24"/>
+          <w:szCs w:val="24"/>
+          <w:lang w:val="en-US" w:eastAsia="zh-CN"/>
+        </w:rPr>
+      </w:pPr>
+      <w:r>
+        <w:rPr>
+          <w:rFonts w:hint="eastAsia"/>
+          <w:sz w:val="24"/>
+          <w:szCs w:val="24"/>
+          <w:lang w:val="en-US" w:eastAsia="zh-CN"/>
+        </w:rPr>
+        <w:t>配置ISP和SZ2的NTP</w:t>
+      </w:r>
+    </w:p>
+    <w:p>
+      <w:pPr>
+        <w:numPr>
+          <w:numId w:val="0"/>
+        </w:numPr>
+        <w:ind w:leftChars="0"/>
+        <w:rPr>
+          <w:rFonts w:hint="eastAsia" w:eastAsiaTheme="minorEastAsia"/>
+          <w:sz w:val="24"/>
+          <w:szCs w:val="24"/>
+          <w:lang w:val="en-US" w:eastAsia="zh-CN"/>
+        </w:rPr>
+      </w:pPr>
+      <w:r>
+        <w:drawing>
+          <wp:inline distT="0" distB="0" distL="114300" distR="114300">
+            <wp:extent cx="2354580" cy="2846070"/>
+            <wp:effectExtent l="0" t="0" r="7620" b="11430"/>
+            <wp:docPr id="4" name="图片 4"/>
+            <wp:cNvGraphicFramePr>
+              <a:graphicFrameLocks xmlns:a="http://schemas.openxmlformats.org/drawingml/2006/main" noChangeAspect="1"/>
+            </wp:cNvGraphicFramePr>
+            <a:graphic xmlns:a="http://schemas.openxmlformats.org/drawingml/2006/main">
+              <a:graphicData uri="http://schemas.openxmlformats.org/drawingml/2006/picture">
+                <pic:pic xmlns:pic="http://schemas.openxmlformats.org/drawingml/2006/picture">
+                  <pic:nvPicPr>
+                    <pic:cNvPr id="4" name="图片 4"/>
+                    <pic:cNvPicPr>
+                      <a:picLocks noChangeAspect="1"/>
+                    </pic:cNvPicPr>
+                  </pic:nvPicPr>
+                  <pic:blipFill>
+                    <a:blip r:embed="rId7"/>
+                    <a:srcRect b="25734"/>
+                    <a:stretch>
+                      <a:fillRect/>
+                    </a:stretch>
+                  </pic:blipFill>
+                  <pic:spPr>
+                    <a:xfrm>
+                      <a:off x="0" y="0"/>
+                      <a:ext cx="2354580" cy="2846070"/>
+                    </a:xfrm>
+                    <a:prstGeom prst="rect">
+                      <a:avLst/>
+                    </a:prstGeom>
+                    <a:noFill/>
+                    <a:ln>
+                      <a:noFill/>
+                    </a:ln>
+                  </pic:spPr>
+                </pic:pic>
+              </a:graphicData>
+            </a:graphic>
+          </wp:inline>
+        </w:drawing>
+      </w:r>
+      <w:r>
+        <w:drawing>
+          <wp:inline distT="0" distB="0" distL="114300" distR="114300">
+            <wp:extent cx="2877185" cy="2817495"/>
+            <wp:effectExtent l="0" t="0" r="18415" b="1905"/>
+            <wp:docPr id="5" name="图片 5"/>
+            <wp:cNvGraphicFramePr>
+              <a:graphicFrameLocks xmlns:a="http://schemas.openxmlformats.org/drawingml/2006/main" noChangeAspect="1"/>
+            </wp:cNvGraphicFramePr>
+            <a:graphic xmlns:a="http://schemas.openxmlformats.org/drawingml/2006/main">
+              <a:graphicData uri="http://schemas.openxmlformats.org/drawingml/2006/picture">
+                <pic:pic xmlns:pic="http://schemas.openxmlformats.org/drawingml/2006/picture">
+                  <pic:nvPicPr>
+                    <pic:cNvPr id="5" name="图片 5"/>
+                    <pic:cNvPicPr>
+                      <a:picLocks noChangeAspect="1"/>
+                    </pic:cNvPicPr>
+                  </pic:nvPicPr>
+                  <pic:blipFill>
+                    <a:blip r:embed="rId8"/>
+                    <a:stretch>
+                      <a:fillRect/>
+                    </a:stretch>
+                  </pic:blipFill>
+                  <pic:spPr>
+                    <a:xfrm>
+                      <a:off x="0" y="0"/>
+                      <a:ext cx="2877185" cy="2817495"/>
+                    </a:xfrm>
+                    <a:prstGeom prst="rect">
+                      <a:avLst/>
+                    </a:prstGeom>
+                    <a:noFill/>
+                    <a:ln>
+                      <a:noFill/>
+                    </a:ln>
+                  </pic:spPr>
+                </pic:pic>
+              </a:graphicData>
+            </a:graphic>
+          </wp:inline>
+        </w:drawing>
+      </w:r>
+    </w:p>
+    <w:p>
+      <w:pPr>
+        <w:numPr>
+          <w:numId w:val="0"/>
+        </w:numPr>
+        <w:ind w:leftChars="0"/>
+        <w:rPr>
+          <w:rFonts w:hint="eastAsia" w:eastAsiaTheme="minorEastAsia"/>
+          <w:sz w:val="24"/>
+          <w:szCs w:val="24"/>
+          <w:lang w:val="en-US" w:eastAsia="zh-CN"/>
+        </w:rPr>
+      </w:pPr>
+    </w:p>
+    <w:p>
+      <w:pPr>
+        <w:numPr>
+          <w:numId w:val="0"/>
+        </w:numPr>
+        <w:ind w:leftChars="0"/>
+        <w:rPr>
+          <w:rFonts w:hint="eastAsia" w:eastAsiaTheme="minorEastAsia"/>
+          <w:sz w:val="24"/>
+          <w:szCs w:val="24"/>
+          <w:lang w:val="en-US" w:eastAsia="zh-CN"/>
+        </w:rPr>
+      </w:pPr>
+    </w:p>
+    <w:p>
+      <w:pPr>
+        <w:numPr>
+          <w:ilvl w:val="0"/>
+          <w:numId w:val="1"/>
+        </w:numPr>
+        <w:ind w:left="0" w:leftChars="0" w:firstLine="0" w:firstLineChars="0"/>
+        <w:rPr>
+          <w:rFonts w:hint="eastAsia" w:eastAsiaTheme="minorEastAsia"/>
+          <w:sz w:val="24"/>
+          <w:szCs w:val="24"/>
+          <w:lang w:val="en-US" w:eastAsia="zh-CN"/>
+        </w:rPr>
+      </w:pPr>
+      <w:r>
+        <w:rPr>
+          <w:rFonts w:hint="eastAsia"/>
+          <w:sz w:val="24"/>
+          <w:szCs w:val="24"/>
+          <w:lang w:val="en-US" w:eastAsia="zh-CN"/>
+        </w:rPr>
+        <w:t>运行代码</w:t>
+      </w:r>
+    </w:p>
+    <w:p>
+      <w:pPr>
+        <w:numPr>
+          <w:numId w:val="0"/>
+        </w:numPr>
+        <w:ind w:leftChars="0"/>
+        <w:rPr>
+          <w:rFonts w:hint="eastAsia"/>
+          <w:sz w:val="24"/>
+          <w:szCs w:val="24"/>
+          <w:lang w:val="en-US" w:eastAsia="zh-CN"/>
+        </w:rPr>
+      </w:pPr>
+      <w:r>
+        <w:rPr>
+          <w:rFonts w:hint="eastAsia"/>
+          <w:sz w:val="24"/>
+          <w:szCs w:val="24"/>
+          <w:lang w:val="en-US" w:eastAsia="zh-CN"/>
+        </w:rPr>
+        <w:t>此时发现cloud与10.3.1.0网段内可通信，10.2.0.0网段不可通信</w:t>
+      </w:r>
+    </w:p>
+    <w:p>
+      <w:pPr>
+        <w:numPr>
+          <w:numId w:val="0"/>
+        </w:numPr>
+        <w:ind w:leftChars="0"/>
+        <w:rPr>
+          <w:rFonts w:hint="eastAsia"/>
+          <w:sz w:val="24"/>
+          <w:szCs w:val="24"/>
+          <w:lang w:val="en-US" w:eastAsia="zh-CN"/>
+        </w:rPr>
+      </w:pPr>
+      <w:r>
+        <w:rPr>
+          <w:rFonts w:hint="eastAsia"/>
+          <w:sz w:val="24"/>
+          <w:szCs w:val="24"/>
+          <w:lang w:val="en-US" w:eastAsia="zh-CN"/>
+        </w:rPr>
+        <w:t>查看宿主机及S4的路由表后发现：</w:t>
+      </w:r>
+    </w:p>
+    <w:p>
+      <w:pPr>
+        <w:numPr>
+          <w:numId w:val="0"/>
+        </w:numPr>
+        <w:ind w:leftChars="0"/>
+      </w:pPr>
+      <w:r>
+        <w:drawing>
+          <wp:inline distT="0" distB="0" distL="114300" distR="114300">
+            <wp:extent cx="5268595" cy="2776220"/>
+            <wp:effectExtent l="0" t="0" r="8255" b="5080"/>
+            <wp:docPr id="6" name="图片 6"/>
+            <wp:cNvGraphicFramePr>
+              <a:graphicFrameLocks xmlns:a="http://schemas.openxmlformats.org/drawingml/2006/main" noChangeAspect="1"/>
+            </wp:cNvGraphicFramePr>
+            <a:graphic xmlns:a="http://schemas.openxmlformats.org/drawingml/2006/main">
+              <a:graphicData uri="http://schemas.openxmlformats.org/drawingml/2006/picture">
+                <pic:pic xmlns:pic="http://schemas.openxmlformats.org/drawingml/2006/picture">
+                  <pic:nvPicPr>
+                    <pic:cNvPr id="6" name="图片 6"/>
+                    <pic:cNvPicPr>
+                      <a:picLocks noChangeAspect="1"/>
+                    </pic:cNvPicPr>
+                  </pic:nvPicPr>
+                  <pic:blipFill>
+                    <a:blip r:embed="rId9"/>
+                    <a:stretch>
+                      <a:fillRect/>
+                    </a:stretch>
+                  </pic:blipFill>
+                  <pic:spPr>
+                    <a:xfrm>
+                      <a:off x="0" y="0"/>
+                      <a:ext cx="5268595" cy="2776220"/>
+                    </a:xfrm>
+                    <a:prstGeom prst="rect">
+                      <a:avLst/>
+                    </a:prstGeom>
+                    <a:noFill/>
+                    <a:ln>
+                      <a:noFill/>
+                    </a:ln>
+                  </pic:spPr>
+                </pic:pic>
+              </a:graphicData>
+            </a:graphic>
+          </wp:inline>
+        </w:drawing>
+      </w:r>
+    </w:p>
+    <w:p>
+      <w:pPr>
+        <w:numPr>
+          <w:numId w:val="0"/>
+        </w:numPr>
+        <w:ind w:leftChars="0"/>
+      </w:pPr>
+      <w:r>
+        <w:drawing>
+          <wp:inline distT="0" distB="0" distL="114300" distR="114300">
+            <wp:extent cx="5268595" cy="3592830"/>
+            <wp:effectExtent l="0" t="0" r="8255" b="7620"/>
+            <wp:docPr id="8" name="图片 8"/>
+            <wp:cNvGraphicFramePr>
+              <a:graphicFrameLocks xmlns:a="http://schemas.openxmlformats.org/drawingml/2006/main" noChangeAspect="1"/>
+            </wp:cNvGraphicFramePr>
+            <a:graphic xmlns:a="http://schemas.openxmlformats.org/drawingml/2006/main">
+              <a:graphicData uri="http://schemas.openxmlformats.org/drawingml/2006/picture">
+                <pic:pic xmlns:pic="http://schemas.openxmlformats.org/drawingml/2006/picture">
+                  <pic:nvPicPr>
+                    <pic:cNvPr id="8" name="图片 8"/>
+                    <pic:cNvPicPr>
+                      <a:picLocks noChangeAspect="1"/>
+                    </pic:cNvPicPr>
+                  </pic:nvPicPr>
+                  <pic:blipFill>
+                    <a:blip r:embed="rId10"/>
+                    <a:stretch>
+                      <a:fillRect/>
+                    </a:stretch>
+                  </pic:blipFill>
+                  <pic:spPr>
+                    <a:xfrm>
+                      <a:off x="0" y="0"/>
+                      <a:ext cx="5268595" cy="3592830"/>
+                    </a:xfrm>
+                    <a:prstGeom prst="rect">
+                      <a:avLst/>
+                    </a:prstGeom>
+                    <a:noFill/>
+                    <a:ln>
+                      <a:noFill/>
+                    </a:ln>
+                  </pic:spPr>
+                </pic:pic>
+              </a:graphicData>
+            </a:graphic>
+          </wp:inline>
+        </w:drawing>
+      </w:r>
+    </w:p>
+    <w:p>
+      <w:pPr>
+        <w:numPr>
+          <w:numId w:val="0"/>
+        </w:numPr>
+        <w:ind w:leftChars="0"/>
+        <w:rPr>
+          <w:rFonts w:hint="eastAsia"/>
+          <w:lang w:val="en-US" w:eastAsia="zh-CN"/>
+        </w:rPr>
+      </w:pPr>
+      <w:r>
+        <w:rPr>
+          <w:rFonts w:hint="eastAsia"/>
+          <w:lang w:val="en-US" w:eastAsia="zh-CN"/>
+        </w:rPr>
+        <w:t>宿主机没有抵达.10.2.0.0网段的路由表</w:t>
+      </w:r>
+    </w:p>
+    <w:p>
+      <w:pPr>
+        <w:numPr>
+          <w:numId w:val="0"/>
+        </w:numPr>
+        <w:ind w:leftChars="0"/>
+        <w:rPr>
+          <w:rFonts w:hint="eastAsia"/>
+          <w:lang w:val="en-US" w:eastAsia="zh-CN"/>
+        </w:rPr>
+      </w:pPr>
+      <w:r>
+        <w:rPr>
+          <w:rFonts w:hint="eastAsia"/>
+          <w:lang w:val="en-US" w:eastAsia="zh-CN"/>
+        </w:rPr>
+        <w:t>故配置route -p add 10.0.0.0 mask 255.0.0.0 10.3.1.254</w:t>
+      </w:r>
+    </w:p>
+    <w:p>
+      <w:pPr>
+        <w:numPr>
+          <w:numId w:val="0"/>
+        </w:numPr>
+        <w:ind w:leftChars="0"/>
+        <w:rPr>
+          <w:rFonts w:hint="eastAsia"/>
+          <w:lang w:val="en-US" w:eastAsia="zh-CN"/>
+        </w:rPr>
+      </w:pPr>
+      <w:r>
+        <w:rPr>
+          <w:rFonts w:hint="eastAsia"/>
+          <w:lang w:val="en-US" w:eastAsia="zh-CN"/>
+        </w:rPr>
+        <w:t>配置完成后ping可通</w:t>
+      </w:r>
+    </w:p>
+    <w:p>
+      <w:pPr>
+        <w:numPr>
+          <w:numId w:val="0"/>
+        </w:numPr>
+        <w:ind w:leftChars="0"/>
+      </w:pPr>
+      <w:r>
+        <w:drawing>
+          <wp:inline distT="0" distB="0" distL="114300" distR="114300">
+            <wp:extent cx="5271770" cy="2264410"/>
+            <wp:effectExtent l="0" t="0" r="5080" b="2540"/>
+            <wp:docPr id="9" name="图片 9"/>
+            <wp:cNvGraphicFramePr>
+              <a:graphicFrameLocks xmlns:a="http://schemas.openxmlformats.org/drawingml/2006/main" noChangeAspect="1"/>
+            </wp:cNvGraphicFramePr>
+            <a:graphic xmlns:a="http://schemas.openxmlformats.org/drawingml/2006/main">
+              <a:graphicData uri="http://schemas.openxmlformats.org/drawingml/2006/picture">
+                <pic:pic xmlns:pic="http://schemas.openxmlformats.org/drawingml/2006/picture">
+                  <pic:nvPicPr>
+                    <pic:cNvPr id="9" name="图片 9"/>
+                    <pic:cNvPicPr>
+                      <a:picLocks noChangeAspect="1"/>
+                    </pic:cNvPicPr>
+                  </pic:nvPicPr>
+                  <pic:blipFill>
+                    <a:blip r:embed="rId11"/>
+                    <a:stretch>
+                      <a:fillRect/>
+                    </a:stretch>
+                  </pic:blipFill>
+                  <pic:spPr>
+                    <a:xfrm>
+                      <a:off x="0" y="0"/>
+                      <a:ext cx="5271770" cy="2264410"/>
+                    </a:xfrm>
+                    <a:prstGeom prst="rect">
+                      <a:avLst/>
+                    </a:prstGeom>
+                    <a:noFill/>
+                    <a:ln>
+                      <a:noFill/>
+                    </a:ln>
+                  </pic:spPr>
+                </pic:pic>
+              </a:graphicData>
+            </a:graphic>
+          </wp:inline>
+        </w:drawing>
+      </w:r>
+    </w:p>
+    <w:p>
+      <w:pPr>
+        <w:numPr>
+          <w:numId w:val="0"/>
+        </w:numPr>
+        <w:ind w:leftChars="0"/>
+      </w:pPr>
+    </w:p>
+    <w:p>
+      <w:pPr>
+        <w:numPr>
+          <w:numId w:val="0"/>
+        </w:numPr>
+        <w:ind w:leftChars="0"/>
+        <w:rPr>
+          <w:rFonts w:hint="eastAsia"/>
+          <w:lang w:val="en-US" w:eastAsia="zh-CN"/>
+        </w:rPr>
+      </w:pPr>
+      <w:r>
+        <w:rPr>
+          <w:rFonts w:hint="eastAsia"/>
+          <w:lang w:val="en-US" w:eastAsia="zh-CN"/>
+        </w:rPr>
+        <w:t>随即运行代码，从图中可见，实验成功</w:t>
+      </w:r>
+    </w:p>
+    <w:p>
+      <w:pPr>
+        <w:numPr>
+          <w:numId w:val="0"/>
+        </w:numPr>
+        <w:ind w:leftChars="0"/>
+      </w:pPr>
+      <w:r>
+        <w:drawing>
+          <wp:inline distT="0" distB="0" distL="114300" distR="114300">
+            <wp:extent cx="5266690" cy="2956560"/>
+            <wp:effectExtent l="0" t="0" r="10160" b="15240"/>
+            <wp:docPr id="10" name="图片 10"/>
+            <wp:cNvGraphicFramePr>
+              <a:graphicFrameLocks xmlns:a="http://schemas.openxmlformats.org/drawingml/2006/main" noChangeAspect="1"/>
+            </wp:cNvGraphicFramePr>
+            <a:graphic xmlns:a="http://schemas.openxmlformats.org/drawingml/2006/main">
+              <a:graphicData uri="http://schemas.openxmlformats.org/drawingml/2006/picture">
+                <pic:pic xmlns:pic="http://schemas.openxmlformats.org/drawingml/2006/picture">
+                  <pic:nvPicPr>
+                    <pic:cNvPr id="10" name="图片 10"/>
+                    <pic:cNvPicPr>
+                      <a:picLocks noChangeAspect="1"/>
+                    </pic:cNvPicPr>
+                  </pic:nvPicPr>
+                  <pic:blipFill>
+                    <a:blip r:embed="rId12"/>
+                    <a:stretch>
+                      <a:fillRect/>
+                    </a:stretch>
+                  </pic:blipFill>
+                  <pic:spPr>
+                    <a:xfrm>
+                      <a:off x="0" y="0"/>
+                      <a:ext cx="5266690" cy="2956560"/>
+                    </a:xfrm>
+                    <a:prstGeom prst="rect">
+                      <a:avLst/>
+                    </a:prstGeom>
+                    <a:noFill/>
+                    <a:ln>
+                      <a:noFill/>
+                    </a:ln>
+                  </pic:spPr>
+                </pic:pic>
+              </a:graphicData>
+            </a:graphic>
+          </wp:inline>
+        </w:drawing>
+      </w:r>
+    </w:p>
+    <w:p>
+      <w:pPr>
+        <w:numPr>
+          <w:numId w:val="0"/>
+        </w:numPr>
+        <w:ind w:leftChars="0"/>
+      </w:pPr>
+      <w:r>
+        <w:drawing>
+          <wp:inline distT="0" distB="0" distL="114300" distR="114300">
+            <wp:extent cx="5266690" cy="2956560"/>
+            <wp:effectExtent l="0" t="0" r="10160" b="15240"/>
+            <wp:docPr id="11" name="图片 11"/>
+            <wp:cNvGraphicFramePr>
+              <a:graphicFrameLocks xmlns:a="http://schemas.openxmlformats.org/drawingml/2006/main" noChangeAspect="1"/>
+            </wp:cNvGraphicFramePr>
+            <a:graphic xmlns:a="http://schemas.openxmlformats.org/drawingml/2006/main">
+              <a:graphicData uri="http://schemas.openxmlformats.org/drawingml/2006/picture">
+                <pic:pic xmlns:pic="http://schemas.openxmlformats.org/drawingml/2006/picture">
+                  <pic:nvPicPr>
+                    <pic:cNvPr id="11" name="图片 11"/>
+                    <pic:cNvPicPr>
+                      <a:picLocks noChangeAspect="1"/>
+                    </pic:cNvPicPr>
+                  </pic:nvPicPr>
+                  <pic:blipFill>
+                    <a:blip r:embed="rId13"/>
+                    <a:stretch>
+                      <a:fillRect/>
+                    </a:stretch>
+                  </pic:blipFill>
+                  <pic:spPr>
+                    <a:xfrm>
+                      <a:off x="0" y="0"/>
+                      <a:ext cx="5266690" cy="2956560"/>
+                    </a:xfrm>
+                    <a:prstGeom prst="rect">
+                      <a:avLst/>
+                    </a:prstGeom>
+                    <a:noFill/>
+                    <a:ln>
+                      <a:noFill/>
+                    </a:ln>
+                  </pic:spPr>
+                </pic:pic>
+              </a:graphicData>
+            </a:graphic>
+          </wp:inline>
+        </w:drawing>
+      </w:r>
+    </w:p>
+    <w:p>
+      <w:pPr>
+        <w:numPr>
+          <w:numId w:val="0"/>
+        </w:numPr>
+        <w:ind w:leftChars="0"/>
+        <w:rPr>
+          <w:rFonts w:hint="default"/>
+          <w:lang w:val="en-US" w:eastAsia="zh-CN"/>
+        </w:rPr>
+      </w:pPr>
+      <w:r>
+        <w:drawing>
+          <wp:inline distT="0" distB="0" distL="114300" distR="114300">
+            <wp:extent cx="5266690" cy="2956560"/>
+            <wp:effectExtent l="0" t="0" r="10160" b="15240"/>
+            <wp:docPr id="12" name="图片 12"/>
+            <wp:cNvGraphicFramePr>
+              <a:graphicFrameLocks xmlns:a="http://schemas.openxmlformats.org/drawingml/2006/main" noChangeAspect="1"/>
+            </wp:cNvGraphicFramePr>
+            <a:graphic xmlns:a="http://schemas.openxmlformats.org/drawingml/2006/main">
+              <a:graphicData uri="http://schemas.openxmlformats.org/drawingml/2006/picture">
+                <pic:pic xmlns:pic="http://schemas.openxmlformats.org/drawingml/2006/picture">
+                  <pic:nvPicPr>
+                    <pic:cNvPr id="12" name="图片 12"/>
+                    <pic:cNvPicPr>
+                      <a:picLocks noChangeAspect="1"/>
+                    </pic:cNvPicPr>
+                  </pic:nvPicPr>
+                  <pic:blipFill>
+                    <a:blip r:embed="rId14"/>
+                    <a:stretch>
+                      <a:fillRect/>
+                    </a:stretch>
+                  </pic:blipFill>
+                  <pic:spPr>
+                    <a:xfrm>
+                      <a:off x="0" y="0"/>
+                      <a:ext cx="5266690" cy="2956560"/>
+                    </a:xfrm>
+                    <a:prstGeom prst="rect">
+                      <a:avLst/>
+                    </a:prstGeom>
+                    <a:noFill/>
+                    <a:ln>
+                      <a:noFill/>
+                    </a:ln>
+                  </pic:spPr>
+                </pic:pic>
+              </a:graphicData>
+            </a:graphic>
+          </wp:inline>
+        </w:drawing>
       </w:r>
       <w:bookmarkStart w:id="0" w:name="_GoBack"/>
+      <w:r>
+        <w:drawing>
+          <wp:inline distT="0" distB="0" distL="114300" distR="114300">
+            <wp:extent cx="5266690" cy="2956560"/>
+            <wp:effectExtent l="0" t="0" r="10160" b="15240"/>
+            <wp:docPr id="13" name="图片 13"/>
+            <wp:cNvGraphicFramePr>
+              <a:graphicFrameLocks xmlns:a="http://schemas.openxmlformats.org/drawingml/2006/main" noChangeAspect="1"/>
+            </wp:cNvGraphicFramePr>
+            <a:graphic xmlns:a="http://schemas.openxmlformats.org/drawingml/2006/main">
+              <a:graphicData uri="http://schemas.openxmlformats.org/drawingml/2006/picture">
+                <pic:pic xmlns:pic="http://schemas.openxmlformats.org/drawingml/2006/picture">
+                  <pic:nvPicPr>
+                    <pic:cNvPr id="13" name="图片 13"/>
+                    <pic:cNvPicPr>
+                      <a:picLocks noChangeAspect="1"/>
+                    </pic:cNvPicPr>
+                  </pic:nvPicPr>
+                  <pic:blipFill>
+                    <a:blip r:embed="rId15"/>
+                    <a:stretch>
+                      <a:fillRect/>
+                    </a:stretch>
+                  </pic:blipFill>
+                  <pic:spPr>
+                    <a:xfrm>
+                      <a:off x="0" y="0"/>
+                      <a:ext cx="5266690" cy="2956560"/>
+                    </a:xfrm>
+                    <a:prstGeom prst="rect">
+                      <a:avLst/>
+                    </a:prstGeom>
+                    <a:noFill/>
+                    <a:ln>
+                      <a:noFill/>
+                    </a:ln>
+                  </pic:spPr>
+                </pic:pic>
+              </a:graphicData>
+            </a:graphic>
+          </wp:inline>
+        </w:drawing>
+      </w:r>
       <w:bookmarkEnd w:id="0"/>
-      <w:r>
-        <w:rPr>
-          <w:rFonts w:hint="eastAsia"/>
-          <w:sz w:val="24"/>
-          <w:szCs w:val="24"/>
-          <w:lang w:val="en-US" w:eastAsia="zh-CN"/>
-        </w:rPr>
-        <w:t>学号水印</w:t>
-      </w:r>
-      <w:r>
-        <w:rPr>
-          <w:rFonts w:hint="eastAsia"/>
-          <w:sz w:val="24"/>
-          <w:szCs w:val="24"/>
-          <w:lang w:eastAsia="zh-CN"/>
-        </w:rPr>
-        <w:t>）</w:t>
-      </w:r>
-      <w:r>
-        <w:rPr>
-          <w:sz w:val="24"/>
-          <w:szCs w:val="24"/>
-        </w:rPr>
-        <w:t>：</w:t>
-      </w:r>
-    </w:p>
-    <w:p>
-      <w:pPr>
-        <w:rPr>
-          <w:rFonts w:hint="default" w:eastAsiaTheme="minorEastAsia"/>
-          <w:sz w:val="24"/>
-          <w:szCs w:val="24"/>
-          <w:lang w:val="en-US" w:eastAsia="zh-CN"/>
-        </w:rPr>
-      </w:pPr>
-      <w:r>
-        <w:rPr>
-          <w:rFonts w:hint="eastAsia"/>
-          <w:sz w:val="24"/>
-          <w:szCs w:val="24"/>
-        </w:rPr>
-        <w:t>1.</w:t>
-      </w:r>
-      <w:r>
-        <w:rPr>
-          <w:rFonts w:hint="eastAsia"/>
-          <w:sz w:val="24"/>
-          <w:szCs w:val="24"/>
-          <w:lang w:val="en-US" w:eastAsia="zh-CN"/>
-        </w:rPr>
-        <w:t>步骤xxx</w:t>
-      </w:r>
-    </w:p>
-    <w:p>
-      <w:pPr>
-        <w:rPr>
-          <w:sz w:val="24"/>
-          <w:szCs w:val="24"/>
-        </w:rPr>
-      </w:pPr>
-    </w:p>
-    <w:p>
-      <w:pPr>
-        <w:rPr>
-          <w:sz w:val="24"/>
-          <w:szCs w:val="24"/>
-        </w:rPr>
-      </w:pPr>
-      <w:r>
-        <w:rPr>
-          <w:sz w:val="24"/>
-          <w:szCs w:val="24"/>
-        </w:rPr>
-        <w:t>2</w:t>
-      </w:r>
-      <w:r>
-        <w:rPr>
-          <w:rFonts w:hint="eastAsia"/>
-          <w:sz w:val="24"/>
-          <w:szCs w:val="24"/>
-        </w:rPr>
-        <w:t>.</w:t>
-      </w:r>
-    </w:p>
-    <w:p>
-      <w:pPr>
-        <w:rPr>
-          <w:sz w:val="24"/>
-          <w:szCs w:val="24"/>
-        </w:rPr>
-      </w:pPr>
-    </w:p>
-    <w:p>
-      <w:pPr>
-        <w:rPr>
-          <w:sz w:val="24"/>
-          <w:szCs w:val="24"/>
-        </w:rPr>
-      </w:pPr>
-      <w:r>
-        <w:rPr>
-          <w:rFonts w:hint="eastAsia"/>
-          <w:sz w:val="24"/>
-          <w:szCs w:val="24"/>
-        </w:rPr>
-        <w:t>3.</w:t>
-      </w:r>
-    </w:p>
-    <w:p>
-      <w:pPr>
-        <w:rPr>
-          <w:sz w:val="24"/>
-          <w:szCs w:val="24"/>
-        </w:rPr>
-      </w:pPr>
-    </w:p>
-    <w:p>
-      <w:pPr>
-        <w:rPr>
-          <w:sz w:val="24"/>
-          <w:szCs w:val="24"/>
-        </w:rPr>
-      </w:pPr>
-      <w:r>
-        <w:rPr>
-          <w:rFonts w:hint="eastAsia"/>
-          <w:sz w:val="24"/>
-          <w:szCs w:val="24"/>
-        </w:rPr>
-        <w:t>。。。。</w:t>
-      </w:r>
+    </w:p>
+    <w:p>
+      <w:pPr>
+        <w:numPr>
+          <w:numId w:val="0"/>
+        </w:numPr>
+        <w:ind w:leftChars="0"/>
+        <w:rPr>
+          <w:rFonts w:hint="default"/>
+          <w:lang w:val="en-US" w:eastAsia="zh-CN"/>
+        </w:rPr>
+      </w:pPr>
+    </w:p>
+    <w:p>
+      <w:pPr>
+        <w:rPr>
+          <w:sz w:val="24"/>
+          <w:szCs w:val="24"/>
+        </w:rPr>
+      </w:pPr>
+    </w:p>
+    <w:p>
+      <w:pPr>
+        <w:rPr>
+          <w:sz w:val="24"/>
+          <w:szCs w:val="24"/>
+        </w:rPr>
+      </w:pPr>
     </w:p>
     <w:tbl>
       <w:tblPr>
@@ -624,6 +1448,26 @@
     </w:sectPr>
   </w:body>
 </w:document>
+</file>
+
+<file path=word/numbering.xml><?xml version="1.0" encoding="utf-8"?>
+<w:numbering xmlns:wpc="http://schemas.microsoft.com/office/word/2010/wordprocessingCanvas" xmlns:mc="http://schemas.openxmlformats.org/markup-compatibility/2006" xmlns:o="urn:schemas-microsoft-com:office:office" xmlns:r="http://schemas.openxmlformats.org/officeDocument/2006/relationships" xmlns:m="http://schemas.openxmlformats.org/officeDocument/2006/math" xmlns:v="urn:schemas-microsoft-com:vml" xmlns:wp14="http://schemas.microsoft.com/office/word/2010/wordprocessingDrawing" xmlns:wp="http://schemas.openxmlformats.org/drawingml/2006/wordprocessingDrawing" xmlns:w10="urn:schemas-microsoft-com:office:word" xmlns:w="http://schemas.openxmlformats.org/wordprocessingml/2006/main" xmlns:w14="http://schemas.microsoft.com/office/word/2010/wordml" xmlns:wpg="http://schemas.microsoft.com/office/word/2010/wordprocessingGroup" xmlns:wpi="http://schemas.microsoft.com/office/word/2010/wordprocessingInk" xmlns:wne="http://schemas.microsoft.com/office/word/2006/wordml" xmlns:wps="http://schemas.microsoft.com/office/word/2010/wordprocessingShape" xmlns:wpsCustomData="http://www.wps.cn/officeDocument/2013/wpsCustomData" mc:Ignorable="w14 wp14">
+  <w:abstractNum w:abstractNumId="0">
+    <w:nsid w:val="DD929FE3"/>
+    <w:multiLevelType w:val="singleLevel"/>
+    <w:tmpl w:val="DD929FE3"/>
+    <w:lvl w:ilvl="0" w:tentative="0">
+      <w:start w:val="1"/>
+      <w:numFmt w:val="decimal"/>
+      <w:suff w:val="space"/>
+      <w:lvlText w:val="%1."/>
+      <w:lvlJc w:val="left"/>
+    </w:lvl>
+  </w:abstractNum>
+  <w:num w:numId="1">
+    <w:abstractNumId w:val="0"/>
+  </w:num>
+</w:numbering>
 </file>
 
 <file path=word/styles.xml><?xml version="1.0" encoding="utf-8"?>

</xml_diff>